<commit_message>
docs: ISD-001 v2.1 intégrant l'analyse de la collection Postman Pipedrive v1
Confirme l'authentification x-api-token et OP-01 (users/me), constate le
retrait des routes v1 persons/deals/activities/pipelines/stages (usage de
la v2 confirmé), ajoute OP-16 (types d'activités) et le test ISD-T17.
FRS v3.0 : références mises à jour vers l'ISD v2.1.

Co-Authored-By: Claude Opus 5.5 <noreply@anthropic.com>
Claude-Session: https://claude.ai/code/session_01ATbuBdTjDZ2Wqxp5QK3Exg
</commit_message>
<xml_diff>
--- a/docs/FRS_Gestion_Actes_Administratifs_Pipedrive_v3.0.docx
+++ b/docs/FRS_Gestion_Actes_Administratifs_Pipedrive_v3.0.docx
@@ -300,7 +300,7 @@
                 <w:sz w:val="18"/>
                 <w:szCs w:val="18"/>
               </w:rPr>
-              <w:t xml:space="preserve">Cahier des charges v3.0 (CDC) · Document d’analyse fonctionnelle v1.0 (AF) · ISD-001 v2.0</w:t>
+              <w:t xml:space="preserve">Cahier des charges v3.0 (CDC) · Document d’analyse fonctionnelle v1.0 (AF) · ISD-001 v2.1</w:t>
             </w:r>
           </w:p>
         </w:tc>
@@ -1192,7 +1192,7 @@
         <w:t xml:space="preserve">Objet.</w:t>
       </w:r>
       <w:r>
-        <w:t xml:space="preserve"> Ce document décrit ce que l’API intermédiaire doit permettre, les échanges avec Pipedrive, les conditions de réussite et les erreurs à traiter. Il est la déclinaison opérationnelle de l’AF : les cas d’utilisation portent la même numérotation (UC01 à UC17). Il précise en plus les endpoints exposés, les contrats d’erreur et les règles d’intégration. Les contrats détaillés des appels Pipedrive figurent dans l’ISD-001 v2.0.</w:t>
+        <w:t xml:space="preserve"> Ce document décrit ce que l’API intermédiaire doit permettre, les échanges avec Pipedrive, les conditions de réussite et les erreurs à traiter. Il est la déclinaison opérationnelle de l’AF : les cas d’utilisation portent la même numérotation (UC01 à UC17). Il précise en plus les endpoints exposés, les contrats d’erreur et les règles d’intégration. Les contrats détaillés des appels Pipedrive figurent dans l’ISD-001 v2.1.</w:t>
       </w:r>
     </w:p>
     <w:p>
@@ -8955,7 +8955,7 @@
         <w:spacing w:after="100" w:line="276"/>
       </w:pPr>
       <w:r>
-        <w:t xml:space="preserve">Ces règles remplacent les règles d’intégration du FRS v2.0. Leur mise en œuvre technique est détaillée dans l’ISD-001 v2.0.</w:t>
+        <w:t xml:space="preserve">Ces règles remplacent les règles d’intégration du FRS v2.0. Leur mise en œuvre technique est détaillée dans l’ISD-001 v2.1.</w:t>
       </w:r>
     </w:p>
     <w:tbl>
@@ -32788,7 +32788,7 @@
                 <w:sz w:val="18"/>
                 <w:szCs w:val="18"/>
               </w:rPr>
-              <w:t xml:space="preserve">À confirmer par les tests de contrat ISD-T01 à ISD-T16</w:t>
+              <w:t xml:space="preserve">À confirmer par les tests de contrat ISD-T01 à ISD-T17 et une collection Pipedrive API v2 (la collection Postman fournie ne couvre que la v1)</w:t>
             </w:r>
           </w:p>
         </w:tc>
@@ -33087,7 +33087,7 @@
         <w:spacing w:after="100" w:line="276"/>
       </w:pPr>
       <w:r>
-        <w:t xml:space="preserve">Les rectangles bleus représentent les participants ; les lignes verticales pointillées leur ligne de vie. Les flèches pleines sont des appels, les flèches pointillées des retours. Les cadres « alt » présentent des alternatives, « opt » une option, « loop » une répétition. Les routes Pipedrive affichées sont celles de l’ISD-001 v2.0 (opérations OP-xx).</w:t>
+        <w:t xml:space="preserve">Les rectangles bleus représentent les participants ; les lignes verticales pointillées leur ligne de vie. Les flèches pleines sont des appels, les flèches pointillées des retours. Les cadres « alt » présentent des alternatives, « opt » une option, « loop » une répétition. Les routes Pipedrive affichées sont celles de l’ISD-001 v2.1 (opérations OP-xx).</w:t>
       </w:r>
     </w:p>
     <w:sectPr>

</xml_diff>